<commit_message>
RV ISA sheet: fix typo in Register Map (t7 => x7), bump to v1.7
</commit_message>
<xml_diff>
--- a/riscv isa reference sheet.docx
+++ b/riscv isa reference sheet.docx
@@ -111,7 +111,7 @@
           <w:sz w:val="22"/>
           <w:szCs w:val="22"/>
         </w:rPr>
-        <w:t>6</w:t>
+        <w:t>7</w:t>
       </w:r>
     </w:p>
     <w:tbl>
@@ -2555,7 +2555,6 @@
               <w:top w:val="nil"/>
               <w:bottom w:val="single" w:sz="4" w:space="0" w:color="auto"/>
             </w:tcBorders>
-            <w:shd w:val="clear" w:color="auto" w:fill="auto"/>
           </w:tcPr>
           <w:p>
             <w:pPr>
@@ -2582,7 +2581,6 @@
               <w:top w:val="nil"/>
               <w:bottom w:val="single" w:sz="4" w:space="0" w:color="auto"/>
             </w:tcBorders>
-            <w:shd w:val="clear" w:color="auto" w:fill="auto"/>
           </w:tcPr>
           <w:p>
             <w:pPr>
@@ -2610,7 +2608,6 @@
               <w:top w:val="nil"/>
               <w:bottom w:val="single" w:sz="4" w:space="0" w:color="auto"/>
             </w:tcBorders>
-            <w:shd w:val="clear" w:color="auto" w:fill="auto"/>
           </w:tcPr>
           <w:p>
             <w:pPr>
@@ -2638,7 +2635,6 @@
               <w:top w:val="nil"/>
               <w:bottom w:val="single" w:sz="4" w:space="0" w:color="auto"/>
             </w:tcBorders>
-            <w:shd w:val="clear" w:color="auto" w:fill="auto"/>
           </w:tcPr>
           <w:p>
             <w:pPr>
@@ -2658,7 +2654,6 @@
               <w:top w:val="nil"/>
               <w:bottom w:val="single" w:sz="4" w:space="0" w:color="auto"/>
             </w:tcBorders>
-            <w:shd w:val="clear" w:color="auto" w:fill="auto"/>
           </w:tcPr>
           <w:p>
             <w:pPr>
@@ -2678,7 +2673,6 @@
               <w:top w:val="nil"/>
               <w:bottom w:val="single" w:sz="4" w:space="0" w:color="auto"/>
             </w:tcBorders>
-            <w:shd w:val="clear" w:color="auto" w:fill="auto"/>
             <w:tcMar>
               <w:left w:w="115" w:type="dxa"/>
               <w:right w:w="0" w:type="dxa"/>
@@ -10440,7 +10434,6 @@
               <w:top w:val="single" w:sz="4" w:space="0" w:color="auto"/>
               <w:bottom w:val="nil"/>
             </w:tcBorders>
-            <w:shd w:val="clear" w:color="auto" w:fill="auto"/>
           </w:tcPr>
           <w:p>
             <w:pPr>
@@ -10483,7 +10476,6 @@
               <w:top w:val="single" w:sz="4" w:space="0" w:color="auto"/>
               <w:bottom w:val="nil"/>
             </w:tcBorders>
-            <w:shd w:val="clear" w:color="auto" w:fill="auto"/>
           </w:tcPr>
           <w:p>
             <w:pPr>
@@ -10511,7 +10503,6 @@
               <w:top w:val="single" w:sz="4" w:space="0" w:color="auto"/>
               <w:bottom w:val="nil"/>
             </w:tcBorders>
-            <w:shd w:val="clear" w:color="auto" w:fill="auto"/>
           </w:tcPr>
           <w:p>
             <w:pPr>
@@ -10539,7 +10530,6 @@
               <w:top w:val="single" w:sz="4" w:space="0" w:color="auto"/>
               <w:bottom w:val="nil"/>
             </w:tcBorders>
-            <w:shd w:val="clear" w:color="auto" w:fill="auto"/>
           </w:tcPr>
           <w:p>
             <w:pPr>
@@ -10567,7 +10557,6 @@
               <w:top w:val="single" w:sz="4" w:space="0" w:color="auto"/>
               <w:bottom w:val="nil"/>
             </w:tcBorders>
-            <w:shd w:val="clear" w:color="auto" w:fill="auto"/>
           </w:tcPr>
           <w:p>
             <w:pPr>
@@ -10595,7 +10584,6 @@
               <w:top w:val="single" w:sz="4" w:space="0" w:color="auto"/>
               <w:bottom w:val="nil"/>
             </w:tcBorders>
-            <w:shd w:val="clear" w:color="auto" w:fill="auto"/>
             <w:tcMar>
               <w:left w:w="115" w:type="dxa"/>
               <w:right w:w="0" w:type="dxa"/>
@@ -10898,7 +10886,6 @@
               <w:top w:val="nil"/>
               <w:bottom w:val="nil"/>
             </w:tcBorders>
-            <w:shd w:val="clear" w:color="auto" w:fill="auto"/>
           </w:tcPr>
           <w:p>
             <w:pPr>
@@ -10925,7 +10912,6 @@
               <w:top w:val="nil"/>
               <w:bottom w:val="nil"/>
             </w:tcBorders>
-            <w:shd w:val="clear" w:color="auto" w:fill="auto"/>
           </w:tcPr>
           <w:p>
             <w:pPr>
@@ -10953,7 +10939,6 @@
               <w:top w:val="nil"/>
               <w:bottom w:val="nil"/>
             </w:tcBorders>
-            <w:shd w:val="clear" w:color="auto" w:fill="auto"/>
           </w:tcPr>
           <w:p>
             <w:pPr>
@@ -10981,7 +10966,6 @@
               <w:top w:val="nil"/>
               <w:bottom w:val="nil"/>
             </w:tcBorders>
-            <w:shd w:val="clear" w:color="auto" w:fill="auto"/>
           </w:tcPr>
           <w:p>
             <w:pPr>
@@ -11009,7 +10993,6 @@
               <w:top w:val="nil"/>
               <w:bottom w:val="nil"/>
             </w:tcBorders>
-            <w:shd w:val="clear" w:color="auto" w:fill="auto"/>
           </w:tcPr>
           <w:p>
             <w:pPr>
@@ -11037,7 +11020,6 @@
               <w:top w:val="nil"/>
               <w:bottom w:val="nil"/>
             </w:tcBorders>
-            <w:shd w:val="clear" w:color="auto" w:fill="auto"/>
             <w:tcMar>
               <w:left w:w="115" w:type="dxa"/>
               <w:right w:w="0" w:type="dxa"/>
@@ -11430,7 +11412,6 @@
               <w:top w:val="single" w:sz="4" w:space="0" w:color="auto"/>
               <w:bottom w:val="nil"/>
             </w:tcBorders>
-            <w:shd w:val="clear" w:color="auto" w:fill="auto"/>
           </w:tcPr>
           <w:p>
             <w:pPr>
@@ -11473,7 +11454,6 @@
               <w:top w:val="single" w:sz="4" w:space="0" w:color="auto"/>
               <w:bottom w:val="nil"/>
             </w:tcBorders>
-            <w:shd w:val="clear" w:color="auto" w:fill="auto"/>
           </w:tcPr>
           <w:p>
             <w:pPr>
@@ -11501,7 +11481,6 @@
               <w:top w:val="single" w:sz="4" w:space="0" w:color="auto"/>
               <w:bottom w:val="nil"/>
             </w:tcBorders>
-            <w:shd w:val="clear" w:color="auto" w:fill="auto"/>
           </w:tcPr>
           <w:p>
             <w:pPr>
@@ -11529,7 +11508,6 @@
               <w:top w:val="single" w:sz="4" w:space="0" w:color="auto"/>
               <w:bottom w:val="nil"/>
             </w:tcBorders>
-            <w:shd w:val="clear" w:color="auto" w:fill="auto"/>
           </w:tcPr>
           <w:p>
             <w:pPr>
@@ -11557,7 +11535,6 @@
               <w:top w:val="single" w:sz="4" w:space="0" w:color="auto"/>
               <w:bottom w:val="nil"/>
             </w:tcBorders>
-            <w:shd w:val="clear" w:color="auto" w:fill="auto"/>
           </w:tcPr>
           <w:p>
             <w:pPr>
@@ -11585,7 +11562,6 @@
               <w:top w:val="single" w:sz="4" w:space="0" w:color="auto"/>
               <w:bottom w:val="nil"/>
             </w:tcBorders>
-            <w:shd w:val="clear" w:color="auto" w:fill="auto"/>
             <w:tcMar>
               <w:left w:w="115" w:type="dxa"/>
               <w:right w:w="0" w:type="dxa"/>
@@ -11798,7 +11774,6 @@
               <w:top w:val="nil"/>
               <w:bottom w:val="nil"/>
             </w:tcBorders>
-            <w:shd w:val="clear" w:color="auto" w:fill="auto"/>
           </w:tcPr>
           <w:p>
             <w:pPr>
@@ -11841,7 +11816,6 @@
               <w:top w:val="nil"/>
               <w:bottom w:val="nil"/>
             </w:tcBorders>
-            <w:shd w:val="clear" w:color="auto" w:fill="auto"/>
           </w:tcPr>
           <w:p>
             <w:pPr>
@@ -11869,7 +11843,6 @@
               <w:top w:val="nil"/>
               <w:bottom w:val="nil"/>
             </w:tcBorders>
-            <w:shd w:val="clear" w:color="auto" w:fill="auto"/>
           </w:tcPr>
           <w:p>
             <w:pPr>
@@ -11897,7 +11870,6 @@
               <w:top w:val="nil"/>
               <w:bottom w:val="nil"/>
             </w:tcBorders>
-            <w:shd w:val="clear" w:color="auto" w:fill="auto"/>
           </w:tcPr>
           <w:p>
             <w:pPr>
@@ -11925,7 +11897,6 @@
               <w:top w:val="nil"/>
               <w:bottom w:val="nil"/>
             </w:tcBorders>
-            <w:shd w:val="clear" w:color="auto" w:fill="auto"/>
           </w:tcPr>
           <w:p>
             <w:pPr>
@@ -11953,7 +11924,6 @@
               <w:top w:val="nil"/>
               <w:bottom w:val="nil"/>
             </w:tcBorders>
-            <w:shd w:val="clear" w:color="auto" w:fill="auto"/>
             <w:tcMar>
               <w:left w:w="115" w:type="dxa"/>
               <w:right w:w="0" w:type="dxa"/>
@@ -12539,7 +12509,15 @@
                 <w:sz w:val="20"/>
                 <w:szCs w:val="20"/>
               </w:rPr>
-              <w:t>t7</w:t>
+              <w:t>x</w:t>
+            </w:r>
+            <w:r>
+              <w:rPr>
+                <w:rFonts w:ascii="Consolas" w:hAnsi="Consolas" w:cs="Consolas"/>
+                <w:sz w:val="20"/>
+                <w:szCs w:val="20"/>
+              </w:rPr>
+              <w:t>7</w:t>
             </w:r>
           </w:p>
         </w:tc>

</xml_diff>